<commit_message>
Lab 4: add Makefile and notes.md, fix title page
</commit_message>
<xml_diff>
--- a/lab4/Lab4_IonDulgheru_FAF-241.docx
+++ b/lab4/Lab4_IonDulgheru_FAF-241.docx
@@ -215,7 +215,7 @@
           <w:sz w:val="24"/>
           <w:szCs w:val="24"/>
         </w:rPr>
-        <w:t xml:space="preserve">Checked by: ____________________</w:t>
+        <w:t xml:space="preserve">Checked by: Reitman Patricia</w:t>
       </w:r>
     </w:p>
     <w:p>
@@ -4625,7 +4625,7 @@
           <w:sz w:val="24"/>
           <w:szCs w:val="24"/>
         </w:rPr>
-        <w:t xml:space="preserve">. This is a personal choice and may be replaced by another justified one, for example the variables or the quotes.</w:t>
+        <w:t xml:space="preserve">.</w:t>
       </w:r>
     </w:p>
     <w:p>

</xml_diff>